<commit_message>
finished task 2 & 3
</commit_message>
<xml_diff>
--- a/Coursework_2 - Word submission template .docx
+++ b/Coursework_2 - Word submission template .docx
@@ -107,7 +107,15 @@
         <w:t xml:space="preserve"> parts to the various sections below.</w:t>
       </w:r>
       <w:r>
-        <w:t xml:space="preserve"> Once complete, add this document to the .git repository and submit it together with your code</w:t>
+        <w:t xml:space="preserve"> Once complete, add this document to </w:t>
+      </w:r>
+      <w:proofErr w:type="gramStart"/>
+      <w:r>
+        <w:t>the .git</w:t>
+      </w:r>
+      <w:proofErr w:type="gramEnd"/>
+      <w:r>
+        <w:t xml:space="preserve"> repository and submit it together with your code</w:t>
       </w:r>
       <w:r>
         <w:t>, text files and</w:t>
@@ -154,9 +162,9 @@
       </w:pPr>
       <w:r>
         <w:drawing>
-          <wp:inline distT="0" distB="0" distL="0" distR="0" wp14:anchorId="1399D790" wp14:editId="22B4E24D">
-            <wp:extent cx="2178536" cy="1634023"/>
-            <wp:effectExtent l="5397" t="0" r="0" b="0"/>
+          <wp:inline distT="0" distB="0" distL="0" distR="0" wp14:anchorId="1399D790" wp14:editId="7A0C24E4">
+            <wp:extent cx="2727202" cy="2045554"/>
+            <wp:effectExtent l="0" t="2223" r="0" b="0"/>
             <wp:docPr id="693040436" name="Picture 2"/>
             <wp:cNvGraphicFramePr>
               <a:graphicFrameLocks xmlns:a="http://schemas.openxmlformats.org/drawingml/2006/main" noChangeAspect="1"/>
@@ -186,7 +194,7 @@
                   <pic:spPr bwMode="auto">
                     <a:xfrm rot="5400000">
                       <a:off x="0" y="0"/>
-                      <a:ext cx="2195692" cy="1646891"/>
+                      <a:ext cx="2754367" cy="2065929"/>
                     </a:xfrm>
                     <a:prstGeom prst="rect">
                       <a:avLst/>
@@ -204,6 +212,13 @@
       </w:r>
     </w:p>
     <w:p/>
+    <w:p/>
+    <w:p/>
+    <w:p/>
+    <w:p/>
+    <w:p/>
+    <w:p/>
+    <w:p/>
     <w:p>
       <w:pPr>
         <w:pStyle w:val="ListParagraph"/>
@@ -214,6 +229,7 @@
         <w:jc w:val="left"/>
       </w:pPr>
       <w:r>
+        <w:lastRenderedPageBreak/>
         <w:t>Include</w:t>
       </w:r>
       <w:r>
@@ -286,7 +302,6 @@
         <w:pStyle w:val="Heading1"/>
       </w:pPr>
       <w:r>
-        <w:lastRenderedPageBreak/>
         <w:t>TASK 2</w:t>
       </w:r>
       <w:r>
@@ -314,6 +329,107 @@
         <w:t>Include a photograph of the implementation here.</w:t>
       </w:r>
     </w:p>
+    <w:p>
+      <w:pPr>
+        <w:pStyle w:val="NormalWeb"/>
+        <w:ind w:left="360"/>
+      </w:pPr>
+      <w:r>
+        <w:rPr>
+          <w:noProof/>
+        </w:rPr>
+        <w:drawing>
+          <wp:inline distT="0" distB="0" distL="0" distR="0" wp14:anchorId="08F27E09" wp14:editId="11352236">
+            <wp:extent cx="2988842" cy="2241774"/>
+            <wp:effectExtent l="0" t="0" r="2540" b="6350"/>
+            <wp:docPr id="1331359255" name="Picture 6"/>
+            <wp:cNvGraphicFramePr>
+              <a:graphicFrameLocks xmlns:a="http://schemas.openxmlformats.org/drawingml/2006/main" noChangeAspect="1"/>
+            </wp:cNvGraphicFramePr>
+            <a:graphic xmlns:a="http://schemas.openxmlformats.org/drawingml/2006/main">
+              <a:graphicData uri="http://schemas.openxmlformats.org/drawingml/2006/picture">
+                <pic:pic xmlns:pic="http://schemas.openxmlformats.org/drawingml/2006/picture">
+                  <pic:nvPicPr>
+                    <pic:cNvPr id="0" name="Picture 21"/>
+                    <pic:cNvPicPr>
+                      <a:picLocks noChangeAspect="1" noChangeArrowheads="1"/>
+                    </pic:cNvPicPr>
+                  </pic:nvPicPr>
+                  <pic:blipFill>
+                    <a:blip r:embed="rId10" cstate="print">
+                      <a:extLst>
+                        <a:ext uri="{28A0092B-C50C-407E-A947-70E740481C1C}">
+                          <a14:useLocalDpi xmlns:a14="http://schemas.microsoft.com/office/drawing/2010/main" val="0"/>
+                        </a:ext>
+                      </a:extLst>
+                    </a:blip>
+                    <a:srcRect/>
+                    <a:stretch>
+                      <a:fillRect/>
+                    </a:stretch>
+                  </pic:blipFill>
+                  <pic:spPr bwMode="auto">
+                    <a:xfrm>
+                      <a:off x="0" y="0"/>
+                      <a:ext cx="2993815" cy="2245504"/>
+                    </a:xfrm>
+                    <a:prstGeom prst="rect">
+                      <a:avLst/>
+                    </a:prstGeom>
+                    <a:noFill/>
+                    <a:ln>
+                      <a:noFill/>
+                    </a:ln>
+                  </pic:spPr>
+                </pic:pic>
+              </a:graphicData>
+            </a:graphic>
+          </wp:inline>
+        </w:drawing>
+      </w:r>
+    </w:p>
+    <w:p>
+      <w:pPr>
+        <w:pStyle w:val="NormalWeb"/>
+        <w:ind w:left="360"/>
+      </w:pPr>
+    </w:p>
+    <w:p>
+      <w:pPr>
+        <w:pStyle w:val="NormalWeb"/>
+        <w:ind w:left="360"/>
+      </w:pPr>
+    </w:p>
+    <w:p>
+      <w:pPr>
+        <w:pStyle w:val="NormalWeb"/>
+        <w:ind w:left="360"/>
+      </w:pPr>
+    </w:p>
+    <w:p>
+      <w:pPr>
+        <w:pStyle w:val="NormalWeb"/>
+        <w:ind w:left="360"/>
+      </w:pPr>
+    </w:p>
+    <w:p>
+      <w:pPr>
+        <w:pStyle w:val="NormalWeb"/>
+        <w:ind w:left="360"/>
+      </w:pPr>
+    </w:p>
+    <w:p>
+      <w:pPr>
+        <w:pStyle w:val="NormalWeb"/>
+        <w:ind w:left="360"/>
+      </w:pPr>
+    </w:p>
+    <w:p>
+      <w:pPr>
+        <w:pStyle w:val="NormalWeb"/>
+        <w:ind w:left="360"/>
+      </w:pPr>
+    </w:p>
     <w:p/>
     <w:p>
       <w:pPr>
@@ -325,6 +441,7 @@
         <w:jc w:val="left"/>
       </w:pPr>
       <w:r>
+        <w:lastRenderedPageBreak/>
         <w:t>Include your</w:t>
       </w:r>
       <w:r>
@@ -338,6 +455,113 @@
       <w:pPr>
         <w:jc w:val="left"/>
       </w:pPr>
+      <w:r>
+        <w:drawing>
+          <wp:inline distT="0" distB="0" distL="0" distR="0" wp14:anchorId="740200D4" wp14:editId="2CF64FC8">
+            <wp:extent cx="2857500" cy="3817657"/>
+            <wp:effectExtent l="0" t="0" r="0" b="0"/>
+            <wp:docPr id="139267762" name="Picture 1"/>
+            <wp:cNvGraphicFramePr>
+              <a:graphicFrameLocks xmlns:a="http://schemas.openxmlformats.org/drawingml/2006/main" noChangeAspect="1"/>
+            </wp:cNvGraphicFramePr>
+            <a:graphic xmlns:a="http://schemas.openxmlformats.org/drawingml/2006/main">
+              <a:graphicData uri="http://schemas.openxmlformats.org/drawingml/2006/picture">
+                <pic:pic xmlns:pic="http://schemas.openxmlformats.org/drawingml/2006/picture">
+                  <pic:nvPicPr>
+                    <pic:cNvPr id="139267762" name=""/>
+                    <pic:cNvPicPr/>
+                  </pic:nvPicPr>
+                  <pic:blipFill>
+                    <a:blip r:embed="rId11"/>
+                    <a:stretch>
+                      <a:fillRect/>
+                    </a:stretch>
+                  </pic:blipFill>
+                  <pic:spPr>
+                    <a:xfrm>
+                      <a:off x="0" y="0"/>
+                      <a:ext cx="2864592" cy="3827132"/>
+                    </a:xfrm>
+                    <a:prstGeom prst="rect">
+                      <a:avLst/>
+                    </a:prstGeom>
+                  </pic:spPr>
+                </pic:pic>
+              </a:graphicData>
+            </a:graphic>
+          </wp:inline>
+        </w:drawing>
+      </w:r>
+    </w:p>
+    <w:p>
+      <w:pPr>
+        <w:jc w:val="left"/>
+      </w:pPr>
+    </w:p>
+    <w:p>
+      <w:pPr>
+        <w:jc w:val="left"/>
+      </w:pPr>
+    </w:p>
+    <w:p>
+      <w:pPr>
+        <w:jc w:val="left"/>
+      </w:pPr>
+    </w:p>
+    <w:p>
+      <w:pPr>
+        <w:jc w:val="left"/>
+      </w:pPr>
+    </w:p>
+    <w:p>
+      <w:pPr>
+        <w:jc w:val="left"/>
+      </w:pPr>
+    </w:p>
+    <w:p>
+      <w:pPr>
+        <w:jc w:val="left"/>
+      </w:pPr>
+    </w:p>
+    <w:p>
+      <w:pPr>
+        <w:jc w:val="left"/>
+      </w:pPr>
+    </w:p>
+    <w:p>
+      <w:pPr>
+        <w:jc w:val="left"/>
+      </w:pPr>
+    </w:p>
+    <w:p>
+      <w:pPr>
+        <w:jc w:val="left"/>
+      </w:pPr>
+    </w:p>
+    <w:p>
+      <w:pPr>
+        <w:jc w:val="left"/>
+      </w:pPr>
+    </w:p>
+    <w:p>
+      <w:pPr>
+        <w:jc w:val="left"/>
+      </w:pPr>
+    </w:p>
+    <w:p>
+      <w:pPr>
+        <w:jc w:val="left"/>
+      </w:pPr>
+    </w:p>
+    <w:p>
+      <w:pPr>
+        <w:jc w:val="left"/>
+      </w:pPr>
+    </w:p>
+    <w:p>
+      <w:pPr>
+        <w:jc w:val="left"/>
+      </w:pPr>
     </w:p>
     <w:p>
       <w:pPr>
@@ -349,6 +573,7 @@
         <w:jc w:val="left"/>
       </w:pPr>
       <w:r>
+        <w:lastRenderedPageBreak/>
         <w:t>Include</w:t>
       </w:r>
       <w:r>
@@ -362,6 +587,52 @@
       <w:pPr>
         <w:jc w:val="left"/>
       </w:pPr>
+      <w:r>
+        <w:rPr>
+          <w:noProof/>
+        </w:rPr>
+        <w:drawing>
+          <wp:inline distT="0" distB="0" distL="0" distR="0" wp14:anchorId="15E0EBC5" wp14:editId="53BEAEEE">
+            <wp:extent cx="2705100" cy="3593614"/>
+            <wp:effectExtent l="0" t="0" r="0" b="6985"/>
+            <wp:docPr id="287554036" name="Picture 4"/>
+            <wp:cNvGraphicFramePr>
+              <a:graphicFrameLocks xmlns:a="http://schemas.openxmlformats.org/drawingml/2006/main" noChangeAspect="1"/>
+            </wp:cNvGraphicFramePr>
+            <a:graphic xmlns:a="http://schemas.openxmlformats.org/drawingml/2006/main">
+              <a:graphicData uri="http://schemas.openxmlformats.org/drawingml/2006/picture">
+                <pic:pic xmlns:pic="http://schemas.openxmlformats.org/drawingml/2006/picture">
+                  <pic:nvPicPr>
+                    <pic:cNvPr id="287554036" name="Picture 287554036"/>
+                    <pic:cNvPicPr/>
+                  </pic:nvPicPr>
+                  <pic:blipFill>
+                    <a:blip r:embed="rId12" cstate="print">
+                      <a:extLst>
+                        <a:ext uri="{28A0092B-C50C-407E-A947-70E740481C1C}">
+                          <a14:useLocalDpi xmlns:a14="http://schemas.microsoft.com/office/drawing/2010/main" val="0"/>
+                        </a:ext>
+                      </a:extLst>
+                    </a:blip>
+                    <a:stretch>
+                      <a:fillRect/>
+                    </a:stretch>
+                  </pic:blipFill>
+                  <pic:spPr>
+                    <a:xfrm>
+                      <a:off x="0" y="0"/>
+                      <a:ext cx="2716328" cy="3608530"/>
+                    </a:xfrm>
+                    <a:prstGeom prst="rect">
+                      <a:avLst/>
+                    </a:prstGeom>
+                  </pic:spPr>
+                </pic:pic>
+              </a:graphicData>
+            </a:graphic>
+          </wp:inline>
+        </w:drawing>
+      </w:r>
     </w:p>
     <w:p>
       <w:pPr>
@@ -381,6 +652,43 @@
         <w:pStyle w:val="ListParagraph"/>
         <w:jc w:val="left"/>
       </w:pPr>
+      <w:r>
+        <w:drawing>
+          <wp:inline distT="0" distB="0" distL="0" distR="0" wp14:anchorId="72B64D08" wp14:editId="7C33FD6A">
+            <wp:extent cx="2369820" cy="3471952"/>
+            <wp:effectExtent l="0" t="0" r="0" b="0"/>
+            <wp:docPr id="1253071617" name="Picture 1"/>
+            <wp:cNvGraphicFramePr>
+              <a:graphicFrameLocks xmlns:a="http://schemas.openxmlformats.org/drawingml/2006/main" noChangeAspect="1"/>
+            </wp:cNvGraphicFramePr>
+            <a:graphic xmlns:a="http://schemas.openxmlformats.org/drawingml/2006/main">
+              <a:graphicData uri="http://schemas.openxmlformats.org/drawingml/2006/picture">
+                <pic:pic xmlns:pic="http://schemas.openxmlformats.org/drawingml/2006/picture">
+                  <pic:nvPicPr>
+                    <pic:cNvPr id="1253071617" name=""/>
+                    <pic:cNvPicPr/>
+                  </pic:nvPicPr>
+                  <pic:blipFill>
+                    <a:blip r:embed="rId13"/>
+                    <a:stretch>
+                      <a:fillRect/>
+                    </a:stretch>
+                  </pic:blipFill>
+                  <pic:spPr>
+                    <a:xfrm>
+                      <a:off x="0" y="0"/>
+                      <a:ext cx="2373848" cy="3477853"/>
+                    </a:xfrm>
+                    <a:prstGeom prst="rect">
+                      <a:avLst/>
+                    </a:prstGeom>
+                  </pic:spPr>
+                </pic:pic>
+              </a:graphicData>
+            </a:graphic>
+          </wp:inline>
+        </w:drawing>
+      </w:r>
     </w:p>
     <w:p>
       <w:pPr>
@@ -402,6 +710,8 @@
         <w:t xml:space="preserve"> – TEMPERATURE PREDICTION</w:t>
       </w:r>
     </w:p>
+    <w:p/>
+    <w:p/>
     <w:p>
       <w:pPr>
         <w:pStyle w:val="ListParagraph"/>
@@ -414,6 +724,50 @@
       </w:pPr>
       <w:r>
         <w:t>Include your initial flowchart here.</w:t>
+      </w:r>
+    </w:p>
+    <w:p>
+      <w:pPr>
+        <w:pStyle w:val="ListParagraph"/>
+        <w:ind w:left="709"/>
+        <w:jc w:val="left"/>
+      </w:pPr>
+      <w:r>
+        <w:drawing>
+          <wp:inline distT="0" distB="0" distL="0" distR="0" wp14:anchorId="3618570E" wp14:editId="20B0431E">
+            <wp:extent cx="2948940" cy="4626560"/>
+            <wp:effectExtent l="0" t="0" r="3810" b="3175"/>
+            <wp:docPr id="1652905910" name="Picture 1"/>
+            <wp:cNvGraphicFramePr>
+              <a:graphicFrameLocks xmlns:a="http://schemas.openxmlformats.org/drawingml/2006/main" noChangeAspect="1"/>
+            </wp:cNvGraphicFramePr>
+            <a:graphic xmlns:a="http://schemas.openxmlformats.org/drawingml/2006/main">
+              <a:graphicData uri="http://schemas.openxmlformats.org/drawingml/2006/picture">
+                <pic:pic xmlns:pic="http://schemas.openxmlformats.org/drawingml/2006/picture">
+                  <pic:nvPicPr>
+                    <pic:cNvPr id="1652905910" name=""/>
+                    <pic:cNvPicPr/>
+                  </pic:nvPicPr>
+                  <pic:blipFill>
+                    <a:blip r:embed="rId14"/>
+                    <a:stretch>
+                      <a:fillRect/>
+                    </a:stretch>
+                  </pic:blipFill>
+                  <pic:spPr>
+                    <a:xfrm>
+                      <a:off x="0" y="0"/>
+                      <a:ext cx="2954284" cy="4634944"/>
+                    </a:xfrm>
+                    <a:prstGeom prst="rect">
+                      <a:avLst/>
+                    </a:prstGeom>
+                  </pic:spPr>
+                </pic:pic>
+              </a:graphicData>
+            </a:graphic>
+          </wp:inline>
+        </w:drawing>
       </w:r>
     </w:p>
     <w:p>
@@ -462,8 +816,8 @@
       </w:pPr>
     </w:p>
     <w:sectPr>
-      <w:headerReference w:type="default" r:id="rId10"/>
-      <w:headerReference w:type="first" r:id="rId11"/>
+      <w:headerReference w:type="default" r:id="rId15"/>
+      <w:headerReference w:type="first" r:id="rId16"/>
       <w:pgSz w:w="11906" w:h="16838"/>
       <w:pgMar w:top="720" w:right="720" w:bottom="720" w:left="720" w:header="708" w:footer="708" w:gutter="0"/>
       <w:cols w:space="708"/>
@@ -6377,6 +6731,24 @@
       <w:shd w:val="clear" w:color="auto" w:fill="E1DFDD"/>
     </w:rPr>
   </w:style>
+  <w:style w:type="paragraph" w:styleId="NormalWeb">
+    <w:name w:val="Normal (Web)"/>
+    <w:basedOn w:val="Normal"/>
+    <w:uiPriority w:val="99"/>
+    <w:semiHidden/>
+    <w:unhideWhenUsed/>
+    <w:rsid w:val="001D2529"/>
+    <w:pPr>
+      <w:spacing w:beforeAutospacing="1" w:after="100" w:afterAutospacing="1" w:line="240" w:lineRule="auto"/>
+      <w:jc w:val="left"/>
+    </w:pPr>
+    <w:rPr>
+      <w:rFonts w:ascii="Times New Roman" w:eastAsia="Times New Roman" w:hAnsi="Times New Roman" w:cs="Times New Roman"/>
+      <w:sz w:val="24"/>
+      <w:szCs w:val="24"/>
+      <w:lang w:eastAsia="en-GB"/>
+    </w:rPr>
+  </w:style>
 </w:styles>
 </file>
 

</xml_diff>